<commit_message>
Add clickable hyperlinks to Unit 3 assignment references
</commit_message>
<xml_diff>
--- a/Term_02/ENGL 1102-01 English Composition 2 - AY2027-T1/Assignments/Unit3_Assignment.docx
+++ b/Term_02/ENGL 1102-01 English Composition 2 - AY2027-T1/Assignments/Unit3_Assignment.docx
@@ -286,8 +286,19 @@
           <w:i w:val="0"/>
           <w:sz w:val="24"/>
         </w:rPr>
-        <w:t>(5), 185. https://doi.org/10.3390/computers14050185</w:t>
+        <w:t xml:space="preserve">(5), 185. </w:t>
       </w:r>
+      <w:hyperlink r:id="rId9">
+        <w:r>
+          <w:rPr>
+            <w:rFonts w:ascii="Times New Roman" w:hAnsi="Times New Roman"/>
+            <w:sz w:val="24"/>
+            <w:color w:val="0563C1"/>
+            <w:u w:val="single"/>
+          </w:rPr>
+          <w:t>https://doi.org/10.3390/computers14050185</w:t>
+        </w:r>
+      </w:hyperlink>
     </w:p>
     <w:p>
       <w:pPr>
@@ -318,8 +329,19 @@
           <w:i w:val="0"/>
           <w:sz w:val="24"/>
         </w:rPr>
-        <w:t>. https://doi.org/10.1007/s10758-026-09998-z</w:t>
+        <w:t xml:space="preserve">. </w:t>
       </w:r>
+      <w:hyperlink r:id="rId10">
+        <w:r>
+          <w:rPr>
+            <w:rFonts w:ascii="Times New Roman" w:hAnsi="Times New Roman"/>
+            <w:sz w:val="24"/>
+            <w:color w:val="0563C1"/>
+            <w:u w:val="single"/>
+          </w:rPr>
+          <w:t>https://doi.org/10.1007/s10758-026-09998-z</w:t>
+        </w:r>
+      </w:hyperlink>
     </w:p>
     <w:p>
       <w:pPr>
@@ -368,8 +390,19 @@
           <w:i w:val="0"/>
           <w:sz w:val="24"/>
         </w:rPr>
-        <w:t>(3), 154. https://doi.org/10.3390/computers15030154</w:t>
+        <w:t xml:space="preserve">(3), 154. </w:t>
       </w:r>
+      <w:hyperlink r:id="rId11">
+        <w:r>
+          <w:rPr>
+            <w:rFonts w:ascii="Times New Roman" w:hAnsi="Times New Roman"/>
+            <w:sz w:val="24"/>
+            <w:color w:val="0563C1"/>
+            <w:u w:val="single"/>
+          </w:rPr>
+          <w:t>https://doi.org/10.3390/computers15030154</w:t>
+        </w:r>
+      </w:hyperlink>
     </w:p>
     <w:p>
       <w:pPr>
@@ -400,8 +433,19 @@
           <w:i w:val="0"/>
           <w:sz w:val="24"/>
         </w:rPr>
-        <w:t xml:space="preserve"> (pp. 1–23). Association for Computing Machinery. https://doi.org/10.1145/3544548.3580919</w:t>
+        <w:t xml:space="preserve"> (pp. 1–23). Association for Computing Machinery. </w:t>
       </w:r>
+      <w:hyperlink r:id="rId12">
+        <w:r>
+          <w:rPr>
+            <w:rFonts w:ascii="Times New Roman" w:hAnsi="Times New Roman"/>
+            <w:sz w:val="24"/>
+            <w:color w:val="0563C1"/>
+            <w:u w:val="single"/>
+          </w:rPr>
+          <w:t>https://doi.org/10.1145/3544548.3580919</w:t>
+        </w:r>
+      </w:hyperlink>
     </w:p>
     <w:p>
       <w:pPr>
@@ -450,8 +494,19 @@
           <w:i w:val="0"/>
           <w:sz w:val="24"/>
         </w:rPr>
-        <w:t>(1), 1–31. https://doi.org/10.1145/3617367</w:t>
+        <w:t xml:space="preserve">(1), 1–31. </w:t>
       </w:r>
+      <w:hyperlink r:id="rId13">
+        <w:r>
+          <w:rPr>
+            <w:rFonts w:ascii="Times New Roman" w:hAnsi="Times New Roman"/>
+            <w:sz w:val="24"/>
+            <w:color w:val="0563C1"/>
+            <w:u w:val="single"/>
+          </w:rPr>
+          <w:t>https://doi.org/10.1145/3617367</w:t>
+        </w:r>
+      </w:hyperlink>
     </w:p>
     <w:p>
       <w:pPr>
@@ -482,8 +537,19 @@
           <w:i w:val="0"/>
           <w:sz w:val="24"/>
         </w:rPr>
-        <w:t>. https://libguides.libraries.wsu.edu/litreview/analysis</w:t>
+        <w:t xml:space="preserve">. </w:t>
       </w:r>
+      <w:hyperlink r:id="rId14">
+        <w:r>
+          <w:rPr>
+            <w:rFonts w:ascii="Times New Roman" w:hAnsi="Times New Roman"/>
+            <w:sz w:val="24"/>
+            <w:color w:val="0563C1"/>
+            <w:u w:val="single"/>
+          </w:rPr>
+          <w:t>https://libguides.libraries.wsu.edu/litreview/analysis</w:t>
+        </w:r>
+      </w:hyperlink>
     </w:p>
     <w:sectPr>
       <w:pgSz w:w="12240" w:h="15840"/>

</xml_diff>